<commit_message>
some fixes + test on real damaged data
</commit_message>
<xml_diff>
--- a/snn_pu_dataset/report/snn_pu_helicopter.docx
+++ b/snn_pu_dataset/report/snn_pu_helicopter.docx
@@ -48,7 +48,10 @@
       </w:r>
       <w:proofErr w:type="gramEnd"/>
       <w:r>
-        <w:t xml:space="preserve"> extreme structural noise, dynamic speed drops, and torque variations.</w:t>
+        <w:t xml:space="preserve"> extreme structural noise, dynamic speed drops, and torque variations</w:t>
+      </w:r>
+      <w:r>
+        <w:t>, and natural real-world metal fatigue.</w:t>
       </w:r>
     </w:p>
     <w:p>
@@ -484,15 +487,11 @@
     </w:p>
     <w:p>
       <w:r>
-        <w:t xml:space="preserve">The final winning genome was translated into VHDL and synthesized for a Xilinx Artix-7 FPGA target operating at 10 </w:t>
-      </w:r>
-      <w:proofErr w:type="spellStart"/>
-      <w:r>
-        <w:t>MHz.</w:t>
-      </w:r>
-      <w:proofErr w:type="spellEnd"/>
-      <w:r>
-        <w:t xml:space="preserve"> The system features a 12-window hardware debouncer to organically suppress transient noise anomalies.</w:t>
+        <w:t xml:space="preserve">To prove the architecture learned fundamental physics rather than dataset noise, the VHDL logic was subjected to a massive 480-file forensic benchmark. The network was trained strictly on artificial drill/EDM faults at a base load. It was then tested against unseen 0.1 Nm torque drops, unseen 400 N </w:t>
+      </w:r>
+      <w:r>
+        <w:lastRenderedPageBreak/>
+        <w:t>radial force drops, and fully authentic natural metal fatigue (bearings run to failure over hundreds of hours).</w:t>
       </w:r>
     </w:p>
     <w:p>
@@ -507,7 +506,6 @@
           <w:b/>
           <w:bCs/>
         </w:rPr>
-        <w:lastRenderedPageBreak/>
         <w:t>5.1 Comparative Run Analysis (240-File Mass Benchmark)</w:t>
       </w:r>
     </w:p>
@@ -522,10 +520,12 @@
         <w:tblLook w:val="04A0" w:firstRow="1" w:lastRow="0" w:firstColumn="1" w:lastColumn="0" w:noHBand="0" w:noVBand="1"/>
       </w:tblPr>
       <w:tblGrid>
-        <w:gridCol w:w="2559"/>
-        <w:gridCol w:w="2085"/>
-        <w:gridCol w:w="2112"/>
-        <w:gridCol w:w="2300"/>
+        <w:gridCol w:w="2594"/>
+        <w:gridCol w:w="2117"/>
+        <w:gridCol w:w="1044"/>
+        <w:gridCol w:w="1044"/>
+        <w:gridCol w:w="1121"/>
+        <w:gridCol w:w="1136"/>
       </w:tblGrid>
       <w:tr>
         <w:trPr>
@@ -591,6 +591,7 @@
         <w:tc>
           <w:tcPr>
             <w:tcW w:w="0" w:type="auto"/>
+            <w:gridSpan w:val="2"/>
             <w:tcBorders>
               <w:top w:val="single" w:sz="6" w:space="0" w:color="auto"/>
               <w:left w:val="single" w:sz="6" w:space="0" w:color="auto"/>
@@ -635,6 +636,7 @@
         <w:tc>
           <w:tcPr>
             <w:tcW w:w="0" w:type="auto"/>
+            <w:gridSpan w:val="2"/>
             <w:tcBorders>
               <w:top w:val="single" w:sz="6" w:space="0" w:color="auto"/>
               <w:left w:val="single" w:sz="6" w:space="0" w:color="auto"/>
@@ -720,6 +722,7 @@
         <w:tc>
           <w:tcPr>
             <w:tcW w:w="0" w:type="auto"/>
+            <w:gridSpan w:val="2"/>
             <w:tcBorders>
               <w:top w:val="single" w:sz="6" w:space="0" w:color="auto"/>
               <w:left w:val="single" w:sz="6" w:space="0" w:color="auto"/>
@@ -744,6 +747,7 @@
         <w:tc>
           <w:tcPr>
             <w:tcW w:w="0" w:type="auto"/>
+            <w:gridSpan w:val="2"/>
             <w:tcBorders>
               <w:top w:val="single" w:sz="6" w:space="0" w:color="auto"/>
               <w:left w:val="single" w:sz="6" w:space="0" w:color="auto"/>
@@ -825,6 +829,7 @@
         <w:tc>
           <w:tcPr>
             <w:tcW w:w="0" w:type="auto"/>
+            <w:gridSpan w:val="2"/>
             <w:tcBorders>
               <w:top w:val="single" w:sz="6" w:space="0" w:color="auto"/>
               <w:left w:val="single" w:sz="6" w:space="0" w:color="auto"/>
@@ -849,6 +854,7 @@
         <w:tc>
           <w:tcPr>
             <w:tcW w:w="0" w:type="auto"/>
+            <w:gridSpan w:val="2"/>
             <w:tcBorders>
               <w:top w:val="single" w:sz="6" w:space="0" w:color="auto"/>
               <w:left w:val="single" w:sz="6" w:space="0" w:color="auto"/>
@@ -934,6 +940,7 @@
         <w:tc>
           <w:tcPr>
             <w:tcW w:w="0" w:type="auto"/>
+            <w:gridSpan w:val="2"/>
             <w:tcBorders>
               <w:top w:val="single" w:sz="6" w:space="0" w:color="auto"/>
               <w:left w:val="single" w:sz="6" w:space="0" w:color="auto"/>
@@ -958,6 +965,7 @@
         <w:tc>
           <w:tcPr>
             <w:tcW w:w="0" w:type="auto"/>
+            <w:gridSpan w:val="2"/>
             <w:tcBorders>
               <w:top w:val="single" w:sz="6" w:space="0" w:color="auto"/>
               <w:left w:val="single" w:sz="6" w:space="0" w:color="auto"/>
@@ -1039,6 +1047,7 @@
         <w:tc>
           <w:tcPr>
             <w:tcW w:w="0" w:type="auto"/>
+            <w:gridSpan w:val="2"/>
             <w:tcBorders>
               <w:top w:val="single" w:sz="6" w:space="0" w:color="auto"/>
               <w:left w:val="single" w:sz="6" w:space="0" w:color="auto"/>
@@ -1063,6 +1072,7 @@
         <w:tc>
           <w:tcPr>
             <w:tcW w:w="0" w:type="auto"/>
+            <w:gridSpan w:val="2"/>
             <w:tcBorders>
               <w:top w:val="single" w:sz="6" w:space="0" w:color="auto"/>
               <w:left w:val="single" w:sz="6" w:space="0" w:color="auto"/>
@@ -1148,6 +1158,7 @@
         <w:tc>
           <w:tcPr>
             <w:tcW w:w="0" w:type="auto"/>
+            <w:gridSpan w:val="2"/>
             <w:tcBorders>
               <w:top w:val="single" w:sz="6" w:space="0" w:color="auto"/>
               <w:left w:val="single" w:sz="6" w:space="0" w:color="auto"/>
@@ -1172,6 +1183,7 @@
         <w:tc>
           <w:tcPr>
             <w:tcW w:w="0" w:type="auto"/>
+            <w:gridSpan w:val="2"/>
             <w:tcBorders>
               <w:top w:val="single" w:sz="6" w:space="0" w:color="auto"/>
               <w:left w:val="single" w:sz="6" w:space="0" w:color="auto"/>
@@ -1257,6 +1269,7 @@
         <w:tc>
           <w:tcPr>
             <w:tcW w:w="0" w:type="auto"/>
+            <w:gridSpan w:val="2"/>
             <w:tcBorders>
               <w:top w:val="single" w:sz="6" w:space="0" w:color="auto"/>
               <w:left w:val="single" w:sz="6" w:space="0" w:color="auto"/>
@@ -1281,6 +1294,7 @@
         <w:tc>
           <w:tcPr>
             <w:tcW w:w="0" w:type="auto"/>
+            <w:gridSpan w:val="2"/>
             <w:tcBorders>
               <w:top w:val="single" w:sz="6" w:space="0" w:color="auto"/>
               <w:left w:val="single" w:sz="6" w:space="0" w:color="auto"/>
@@ -1366,6 +1380,7 @@
         <w:tc>
           <w:tcPr>
             <w:tcW w:w="0" w:type="auto"/>
+            <w:gridSpan w:val="2"/>
             <w:tcBorders>
               <w:top w:val="single" w:sz="6" w:space="0" w:color="auto"/>
               <w:left w:val="single" w:sz="6" w:space="0" w:color="auto"/>
@@ -1390,6 +1405,7 @@
         <w:tc>
           <w:tcPr>
             <w:tcW w:w="0" w:type="auto"/>
+            <w:gridSpan w:val="2"/>
             <w:tcBorders>
               <w:top w:val="single" w:sz="6" w:space="0" w:color="auto"/>
               <w:left w:val="single" w:sz="6" w:space="0" w:color="auto"/>
@@ -1475,6 +1491,7 @@
         <w:tc>
           <w:tcPr>
             <w:tcW w:w="0" w:type="auto"/>
+            <w:gridSpan w:val="2"/>
             <w:tcBorders>
               <w:top w:val="single" w:sz="6" w:space="0" w:color="auto"/>
               <w:left w:val="single" w:sz="6" w:space="0" w:color="auto"/>
@@ -1499,6 +1516,7 @@
         <w:tc>
           <w:tcPr>
             <w:tcW w:w="0" w:type="auto"/>
+            <w:gridSpan w:val="2"/>
             <w:tcBorders>
               <w:top w:val="single" w:sz="6" w:space="0" w:color="auto"/>
               <w:left w:val="single" w:sz="6" w:space="0" w:color="auto"/>
@@ -1584,6 +1602,7 @@
         <w:tc>
           <w:tcPr>
             <w:tcW w:w="0" w:type="auto"/>
+            <w:gridSpan w:val="2"/>
             <w:tcBorders>
               <w:top w:val="single" w:sz="6" w:space="0" w:color="auto"/>
               <w:left w:val="single" w:sz="6" w:space="0" w:color="auto"/>
@@ -1608,6 +1627,7 @@
         <w:tc>
           <w:tcPr>
             <w:tcW w:w="0" w:type="auto"/>
+            <w:gridSpan w:val="2"/>
             <w:tcBorders>
               <w:top w:val="single" w:sz="6" w:space="0" w:color="auto"/>
               <w:left w:val="single" w:sz="6" w:space="0" w:color="auto"/>
@@ -1693,6 +1713,7 @@
         <w:tc>
           <w:tcPr>
             <w:tcW w:w="0" w:type="auto"/>
+            <w:gridSpan w:val="2"/>
             <w:tcBorders>
               <w:top w:val="single" w:sz="6" w:space="0" w:color="auto"/>
               <w:left w:val="single" w:sz="6" w:space="0" w:color="auto"/>
@@ -1717,6 +1738,7 @@
         <w:tc>
           <w:tcPr>
             <w:tcW w:w="0" w:type="auto"/>
+            <w:gridSpan w:val="2"/>
             <w:tcBorders>
               <w:top w:val="single" w:sz="6" w:space="0" w:color="auto"/>
               <w:left w:val="single" w:sz="6" w:space="0" w:color="auto"/>
@@ -1802,6 +1824,7 @@
         <w:tc>
           <w:tcPr>
             <w:tcW w:w="0" w:type="auto"/>
+            <w:gridSpan w:val="2"/>
             <w:tcBorders>
               <w:top w:val="single" w:sz="6" w:space="0" w:color="auto"/>
               <w:left w:val="single" w:sz="6" w:space="0" w:color="auto"/>
@@ -1826,6 +1849,7 @@
         <w:tc>
           <w:tcPr>
             <w:tcW w:w="0" w:type="auto"/>
+            <w:gridSpan w:val="2"/>
             <w:tcBorders>
               <w:top w:val="single" w:sz="6" w:space="0" w:color="auto"/>
               <w:left w:val="single" w:sz="6" w:space="0" w:color="auto"/>
@@ -1901,22 +1925,14 @@
           </w:tcPr>
           <w:p>
             <w:r>
-              <w:t>812</w:t>
-            </w:r>
-            <w:r>
-              <w:t xml:space="preserve"> (</w:t>
-            </w:r>
-            <w:r>
-              <w:t>1.95</w:t>
-            </w:r>
-            <w:r>
-              <w:t>%)</w:t>
-            </w:r>
-          </w:p>
-        </w:tc>
-        <w:tc>
-          <w:tcPr>
-            <w:tcW w:w="0" w:type="auto"/>
+              <w:t>812 (1.95%)</w:t>
+            </w:r>
+          </w:p>
+        </w:tc>
+        <w:tc>
+          <w:tcPr>
+            <w:tcW w:w="0" w:type="auto"/>
+            <w:gridSpan w:val="2"/>
             <w:tcBorders>
               <w:top w:val="single" w:sz="6" w:space="0" w:color="auto"/>
               <w:left w:val="single" w:sz="6" w:space="0" w:color="auto"/>
@@ -1941,6 +1957,7 @@
         <w:tc>
           <w:tcPr>
             <w:tcW w:w="0" w:type="auto"/>
+            <w:gridSpan w:val="2"/>
             <w:tcBorders>
               <w:top w:val="single" w:sz="6" w:space="0" w:color="auto"/>
               <w:left w:val="single" w:sz="6" w:space="0" w:color="auto"/>
@@ -1959,6 +1976,497 @@
           <w:p>
             <w:r>
               <w:t>773 (1.8%)</w:t>
+            </w:r>
+          </w:p>
+        </w:tc>
+      </w:tr>
+      <w:tr>
+        <w:trPr>
+          <w:gridAfter w:val="1"/>
+          <w:tblHeader/>
+          <w:tblCellSpacing w:w="15" w:type="dxa"/>
+        </w:trPr>
+        <w:tc>
+          <w:tcPr>
+            <w:tcW w:w="0" w:type="auto"/>
+            <w:gridSpan w:val="3"/>
+            <w:tcBorders>
+              <w:top w:val="single" w:sz="6" w:space="0" w:color="auto"/>
+              <w:left w:val="single" w:sz="6" w:space="0" w:color="auto"/>
+              <w:bottom w:val="single" w:sz="6" w:space="0" w:color="auto"/>
+              <w:right w:val="single" w:sz="6" w:space="0" w:color="auto"/>
+            </w:tcBorders>
+            <w:tcMar>
+              <w:top w:w="240" w:type="dxa"/>
+              <w:left w:w="0" w:type="dxa"/>
+              <w:bottom w:w="240" w:type="dxa"/>
+              <w:right w:w="180" w:type="dxa"/>
+            </w:tcMar>
+            <w:vAlign w:val="center"/>
+            <w:hideMark/>
+          </w:tcPr>
+          <w:p>
+            <w:pPr>
+              <w:rPr>
+                <w:b/>
+                <w:bCs/>
+                <w:lang w:val="en-GB"/>
+              </w:rPr>
+            </w:pPr>
+            <w:r>
+              <w:rPr>
+                <w:b/>
+                <w:bCs/>
+                <w:lang w:val="en-GB"/>
+              </w:rPr>
+              <w:t>Metric</w:t>
+            </w:r>
+          </w:p>
+        </w:tc>
+        <w:tc>
+          <w:tcPr>
+            <w:tcW w:w="0" w:type="auto"/>
+            <w:gridSpan w:val="2"/>
+            <w:tcBorders>
+              <w:top w:val="single" w:sz="6" w:space="0" w:color="auto"/>
+              <w:left w:val="single" w:sz="6" w:space="0" w:color="auto"/>
+              <w:bottom w:val="single" w:sz="6" w:space="0" w:color="auto"/>
+              <w:right w:val="single" w:sz="6" w:space="0" w:color="auto"/>
+            </w:tcBorders>
+            <w:tcMar>
+              <w:top w:w="240" w:type="dxa"/>
+              <w:left w:w="0" w:type="dxa"/>
+              <w:bottom w:w="240" w:type="dxa"/>
+              <w:right w:w="0" w:type="dxa"/>
+            </w:tcMar>
+            <w:vAlign w:val="center"/>
+            <w:hideMark/>
+          </w:tcPr>
+          <w:p>
+            <w:pPr>
+              <w:rPr>
+                <w:b/>
+                <w:bCs/>
+                <w:lang w:val="en-GB"/>
+              </w:rPr>
+            </w:pPr>
+            <w:proofErr w:type="spellStart"/>
+            <w:r>
+              <w:rPr>
+                <w:b/>
+                <w:bCs/>
+                <w:lang w:val="en-GB"/>
+              </w:rPr>
+              <w:t>Vivado</w:t>
+            </w:r>
+            <w:proofErr w:type="spellEnd"/>
+            <w:r>
+              <w:rPr>
+                <w:b/>
+                <w:bCs/>
+                <w:lang w:val="en-GB"/>
+              </w:rPr>
+              <w:t xml:space="preserve"> Performance</w:t>
+            </w:r>
+          </w:p>
+        </w:tc>
+      </w:tr>
+      <w:tr>
+        <w:trPr>
+          <w:gridAfter w:val="1"/>
+          <w:tblCellSpacing w:w="15" w:type="dxa"/>
+        </w:trPr>
+        <w:tc>
+          <w:tcPr>
+            <w:tcW w:w="0" w:type="auto"/>
+            <w:gridSpan w:val="3"/>
+            <w:tcBorders>
+              <w:top w:val="single" w:sz="6" w:space="0" w:color="auto"/>
+              <w:left w:val="single" w:sz="6" w:space="0" w:color="auto"/>
+              <w:bottom w:val="single" w:sz="6" w:space="0" w:color="auto"/>
+              <w:right w:val="single" w:sz="6" w:space="0" w:color="auto"/>
+            </w:tcBorders>
+            <w:tcMar>
+              <w:top w:w="240" w:type="dxa"/>
+              <w:left w:w="0" w:type="dxa"/>
+              <w:bottom w:w="240" w:type="dxa"/>
+              <w:right w:w="180" w:type="dxa"/>
+            </w:tcMar>
+            <w:vAlign w:val="center"/>
+            <w:hideMark/>
+          </w:tcPr>
+          <w:p>
+            <w:pPr>
+              <w:rPr>
+                <w:b/>
+                <w:bCs/>
+                <w:lang w:val="en-GB"/>
+              </w:rPr>
+            </w:pPr>
+            <w:r>
+              <w:rPr>
+                <w:b/>
+                <w:bCs/>
+                <w:lang w:val="en-GB"/>
+              </w:rPr>
+              <w:t>Overall Mass Macro-Accuracy (480 Files)</w:t>
+            </w:r>
+          </w:p>
+        </w:tc>
+        <w:tc>
+          <w:tcPr>
+            <w:tcW w:w="0" w:type="auto"/>
+            <w:gridSpan w:val="2"/>
+            <w:tcBorders>
+              <w:top w:val="single" w:sz="6" w:space="0" w:color="auto"/>
+              <w:left w:val="single" w:sz="6" w:space="0" w:color="auto"/>
+              <w:bottom w:val="single" w:sz="6" w:space="0" w:color="auto"/>
+              <w:right w:val="single" w:sz="6" w:space="0" w:color="auto"/>
+            </w:tcBorders>
+            <w:tcMar>
+              <w:top w:w="240" w:type="dxa"/>
+              <w:left w:w="0" w:type="dxa"/>
+              <w:bottom w:w="240" w:type="dxa"/>
+              <w:right w:w="0" w:type="dxa"/>
+            </w:tcMar>
+            <w:vAlign w:val="center"/>
+            <w:hideMark/>
+          </w:tcPr>
+          <w:p>
+            <w:pPr>
+              <w:rPr>
+                <w:b/>
+                <w:bCs/>
+                <w:lang w:val="en-GB"/>
+              </w:rPr>
+            </w:pPr>
+            <w:r>
+              <w:rPr>
+                <w:b/>
+                <w:bCs/>
+                <w:lang w:val="en-GB"/>
+              </w:rPr>
+              <w:t>95.22%</w:t>
+            </w:r>
+          </w:p>
+        </w:tc>
+      </w:tr>
+      <w:tr>
+        <w:trPr>
+          <w:gridAfter w:val="1"/>
+          <w:tblCellSpacing w:w="15" w:type="dxa"/>
+        </w:trPr>
+        <w:tc>
+          <w:tcPr>
+            <w:tcW w:w="0" w:type="auto"/>
+            <w:gridSpan w:val="3"/>
+            <w:tcBorders>
+              <w:top w:val="single" w:sz="6" w:space="0" w:color="auto"/>
+              <w:left w:val="single" w:sz="6" w:space="0" w:color="auto"/>
+              <w:bottom w:val="single" w:sz="6" w:space="0" w:color="auto"/>
+              <w:right w:val="single" w:sz="6" w:space="0" w:color="auto"/>
+            </w:tcBorders>
+            <w:tcMar>
+              <w:top w:w="240" w:type="dxa"/>
+              <w:left w:w="0" w:type="dxa"/>
+              <w:bottom w:w="240" w:type="dxa"/>
+              <w:right w:w="180" w:type="dxa"/>
+            </w:tcMar>
+            <w:vAlign w:val="center"/>
+            <w:hideMark/>
+          </w:tcPr>
+          <w:p>
+            <w:pPr>
+              <w:rPr>
+                <w:b/>
+                <w:bCs/>
+                <w:lang w:val="en-GB"/>
+              </w:rPr>
+            </w:pPr>
+            <w:r>
+              <w:rPr>
+                <w:b/>
+                <w:bCs/>
+                <w:lang w:val="en-GB"/>
+              </w:rPr>
+              <w:t>Unseen Zero-Shot Domain Accuracy</w:t>
+            </w:r>
+          </w:p>
+        </w:tc>
+        <w:tc>
+          <w:tcPr>
+            <w:tcW w:w="0" w:type="auto"/>
+            <w:gridSpan w:val="2"/>
+            <w:tcBorders>
+              <w:top w:val="single" w:sz="6" w:space="0" w:color="auto"/>
+              <w:left w:val="single" w:sz="6" w:space="0" w:color="auto"/>
+              <w:bottom w:val="single" w:sz="6" w:space="0" w:color="auto"/>
+              <w:right w:val="single" w:sz="6" w:space="0" w:color="auto"/>
+            </w:tcBorders>
+            <w:tcMar>
+              <w:top w:w="240" w:type="dxa"/>
+              <w:left w:w="0" w:type="dxa"/>
+              <w:bottom w:w="240" w:type="dxa"/>
+              <w:right w:w="0" w:type="dxa"/>
+            </w:tcMar>
+            <w:vAlign w:val="center"/>
+            <w:hideMark/>
+          </w:tcPr>
+          <w:p>
+            <w:pPr>
+              <w:rPr>
+                <w:b/>
+                <w:bCs/>
+                <w:lang w:val="en-GB"/>
+              </w:rPr>
+            </w:pPr>
+            <w:r>
+              <w:rPr>
+                <w:b/>
+                <w:bCs/>
+                <w:lang w:val="en-GB"/>
+              </w:rPr>
+              <w:t>99.20%</w:t>
+            </w:r>
+          </w:p>
+        </w:tc>
+      </w:tr>
+      <w:tr>
+        <w:trPr>
+          <w:gridAfter w:val="1"/>
+          <w:tblCellSpacing w:w="15" w:type="dxa"/>
+        </w:trPr>
+        <w:tc>
+          <w:tcPr>
+            <w:tcW w:w="0" w:type="auto"/>
+            <w:gridSpan w:val="3"/>
+            <w:tcBorders>
+              <w:top w:val="single" w:sz="6" w:space="0" w:color="auto"/>
+              <w:left w:val="single" w:sz="6" w:space="0" w:color="auto"/>
+              <w:bottom w:val="single" w:sz="6" w:space="0" w:color="auto"/>
+              <w:right w:val="single" w:sz="6" w:space="0" w:color="auto"/>
+            </w:tcBorders>
+            <w:tcMar>
+              <w:top w:w="240" w:type="dxa"/>
+              <w:left w:w="0" w:type="dxa"/>
+              <w:bottom w:w="240" w:type="dxa"/>
+              <w:right w:w="180" w:type="dxa"/>
+            </w:tcMar>
+            <w:vAlign w:val="center"/>
+            <w:hideMark/>
+          </w:tcPr>
+          <w:p>
+            <w:pPr>
+              <w:rPr>
+                <w:b/>
+                <w:bCs/>
+                <w:lang w:val="en-GB"/>
+              </w:rPr>
+            </w:pPr>
+            <w:r>
+              <w:rPr>
+                <w:b/>
+                <w:bCs/>
+                <w:lang w:val="en-GB"/>
+              </w:rPr>
+              <w:t>False Alarms on Healthy Baseline</w:t>
+            </w:r>
+          </w:p>
+        </w:tc>
+        <w:tc>
+          <w:tcPr>
+            <w:tcW w:w="0" w:type="auto"/>
+            <w:gridSpan w:val="2"/>
+            <w:tcBorders>
+              <w:top w:val="single" w:sz="6" w:space="0" w:color="auto"/>
+              <w:left w:val="single" w:sz="6" w:space="0" w:color="auto"/>
+              <w:bottom w:val="single" w:sz="6" w:space="0" w:color="auto"/>
+              <w:right w:val="single" w:sz="6" w:space="0" w:color="auto"/>
+            </w:tcBorders>
+            <w:tcMar>
+              <w:top w:w="240" w:type="dxa"/>
+              <w:left w:w="0" w:type="dxa"/>
+              <w:bottom w:w="240" w:type="dxa"/>
+              <w:right w:w="0" w:type="dxa"/>
+            </w:tcMar>
+            <w:vAlign w:val="center"/>
+            <w:hideMark/>
+          </w:tcPr>
+          <w:p>
+            <w:pPr>
+              <w:rPr>
+                <w:b/>
+                <w:bCs/>
+                <w:lang w:val="en-GB"/>
+              </w:rPr>
+            </w:pPr>
+            <w:r>
+              <w:rPr>
+                <w:b/>
+                <w:bCs/>
+                <w:lang w:val="en-GB"/>
+              </w:rPr>
+              <w:t>0 (100.00% Specificity)</w:t>
+            </w:r>
+          </w:p>
+        </w:tc>
+      </w:tr>
+      <w:tr>
+        <w:trPr>
+          <w:gridAfter w:val="1"/>
+          <w:tblCellSpacing w:w="15" w:type="dxa"/>
+        </w:trPr>
+        <w:tc>
+          <w:tcPr>
+            <w:tcW w:w="0" w:type="auto"/>
+            <w:gridSpan w:val="3"/>
+            <w:tcBorders>
+              <w:top w:val="single" w:sz="6" w:space="0" w:color="auto"/>
+              <w:left w:val="single" w:sz="6" w:space="0" w:color="auto"/>
+              <w:bottom w:val="single" w:sz="6" w:space="0" w:color="auto"/>
+              <w:right w:val="single" w:sz="6" w:space="0" w:color="auto"/>
+            </w:tcBorders>
+            <w:tcMar>
+              <w:top w:w="240" w:type="dxa"/>
+              <w:left w:w="0" w:type="dxa"/>
+              <w:bottom w:w="240" w:type="dxa"/>
+              <w:right w:w="180" w:type="dxa"/>
+            </w:tcMar>
+            <w:vAlign w:val="center"/>
+            <w:hideMark/>
+          </w:tcPr>
+          <w:p>
+            <w:pPr>
+              <w:rPr>
+                <w:b/>
+                <w:bCs/>
+                <w:lang w:val="en-GB"/>
+              </w:rPr>
+            </w:pPr>
+            <w:r>
+              <w:rPr>
+                <w:b/>
+                <w:bCs/>
+                <w:lang w:val="en-GB"/>
+              </w:rPr>
+              <w:t>Real Natural Outer Race Accuracy</w:t>
+            </w:r>
+          </w:p>
+        </w:tc>
+        <w:tc>
+          <w:tcPr>
+            <w:tcW w:w="0" w:type="auto"/>
+            <w:gridSpan w:val="2"/>
+            <w:tcBorders>
+              <w:top w:val="single" w:sz="6" w:space="0" w:color="auto"/>
+              <w:left w:val="single" w:sz="6" w:space="0" w:color="auto"/>
+              <w:bottom w:val="single" w:sz="6" w:space="0" w:color="auto"/>
+              <w:right w:val="single" w:sz="6" w:space="0" w:color="auto"/>
+            </w:tcBorders>
+            <w:tcMar>
+              <w:top w:w="240" w:type="dxa"/>
+              <w:left w:w="0" w:type="dxa"/>
+              <w:bottom w:w="240" w:type="dxa"/>
+              <w:right w:w="0" w:type="dxa"/>
+            </w:tcMar>
+            <w:vAlign w:val="center"/>
+            <w:hideMark/>
+          </w:tcPr>
+          <w:p>
+            <w:pPr>
+              <w:rPr>
+                <w:b/>
+                <w:bCs/>
+                <w:lang w:val="en-GB"/>
+              </w:rPr>
+            </w:pPr>
+            <w:r>
+              <w:rPr>
+                <w:b/>
+                <w:bCs/>
+                <w:lang w:val="en-GB"/>
+              </w:rPr>
+              <w:t>99.82%</w:t>
+            </w:r>
+          </w:p>
+        </w:tc>
+      </w:tr>
+      <w:tr>
+        <w:trPr>
+          <w:gridAfter w:val="1"/>
+          <w:tblCellSpacing w:w="15" w:type="dxa"/>
+        </w:trPr>
+        <w:tc>
+          <w:tcPr>
+            <w:tcW w:w="0" w:type="auto"/>
+            <w:gridSpan w:val="3"/>
+            <w:tcBorders>
+              <w:top w:val="single" w:sz="6" w:space="0" w:color="auto"/>
+              <w:left w:val="single" w:sz="6" w:space="0" w:color="auto"/>
+              <w:bottom w:val="single" w:sz="6" w:space="0" w:color="auto"/>
+              <w:right w:val="single" w:sz="6" w:space="0" w:color="auto"/>
+            </w:tcBorders>
+            <w:tcMar>
+              <w:top w:w="240" w:type="dxa"/>
+              <w:left w:w="0" w:type="dxa"/>
+              <w:bottom w:w="240" w:type="dxa"/>
+              <w:right w:w="180" w:type="dxa"/>
+            </w:tcMar>
+            <w:vAlign w:val="center"/>
+            <w:hideMark/>
+          </w:tcPr>
+          <w:p>
+            <w:pPr>
+              <w:rPr>
+                <w:b/>
+                <w:bCs/>
+                <w:lang w:val="en-GB"/>
+              </w:rPr>
+            </w:pPr>
+            <w:r>
+              <w:rPr>
+                <w:b/>
+                <w:bCs/>
+                <w:lang w:val="en-GB"/>
+              </w:rPr>
+              <w:t>Real Combined Fault Accuracy</w:t>
+            </w:r>
+          </w:p>
+        </w:tc>
+        <w:tc>
+          <w:tcPr>
+            <w:tcW w:w="0" w:type="auto"/>
+            <w:gridSpan w:val="2"/>
+            <w:tcBorders>
+              <w:top w:val="single" w:sz="6" w:space="0" w:color="auto"/>
+              <w:left w:val="single" w:sz="6" w:space="0" w:color="auto"/>
+              <w:bottom w:val="single" w:sz="6" w:space="0" w:color="auto"/>
+              <w:right w:val="single" w:sz="6" w:space="0" w:color="auto"/>
+            </w:tcBorders>
+            <w:tcMar>
+              <w:top w:w="240" w:type="dxa"/>
+              <w:left w:w="0" w:type="dxa"/>
+              <w:bottom w:w="240" w:type="dxa"/>
+              <w:right w:w="0" w:type="dxa"/>
+            </w:tcMar>
+            <w:vAlign w:val="center"/>
+            <w:hideMark/>
+          </w:tcPr>
+          <w:p>
+            <w:pPr>
+              <w:rPr>
+                <w:b/>
+                <w:bCs/>
+                <w:lang w:val="en-GB"/>
+              </w:rPr>
+            </w:pPr>
+            <w:r>
+              <w:rPr>
+                <w:b/>
+                <w:bCs/>
+                <w:lang w:val="en-GB"/>
+              </w:rPr>
+              <w:t>99.64%</w:t>
             </w:r>
           </w:p>
         </w:tc>
@@ -1971,20 +2479,35 @@
           <w:bCs/>
         </w:rPr>
       </w:pPr>
-      <w:r>
+    </w:p>
+    <w:p>
+      <w:pPr>
         <w:rPr>
           <w:b/>
           <w:bCs/>
         </w:rPr>
-        <w:t>6. Conclusion</w:t>
-      </w:r>
+      </w:pPr>
     </w:p>
     <w:p>
-      <w:r>
-        <w:t>This architecture successfully bridges the gap between advanced neuro-evolutionary algorithms and ultra-low-power silicon engineering. By relying on strict mechanical physics to dictate the temporal window dimensions, the final 1-32-1 SNN achieved 99.84% accuracy across 240 chaotic, multi-domain files. Drawing merely 10 milliwatts of dynamic power and requiring zero DSP blocks, this system provides a highly viable, deployable solution for continuous edge-monitoring in critical defense and aerospace infrastructure.</w:t>
+      <w:pPr>
+        <w:rPr>
+          <w:b/>
+          <w:bCs/>
+        </w:rPr>
+      </w:pPr>
+      <w:r>
+        <w:rPr>
+          <w:b/>
+          <w:bCs/>
+        </w:rPr>
+        <w:t>6. Conclusion</w:t>
       </w:r>
     </w:p>
-    <w:p/>
+    <w:p>
+      <w:r>
+        <w:t>This architecture successfully bridges the gap between advanced neuro-evolutionary algorithms and ultra-low-power silicon engineering. By relying on strict mechanical physics to dictate the temporal window dimensions, the final 1-32-1 SNN achieved 95.22% overall accuracy—and an exceptional 99.20% on unseen domains—across 480 chaotic, real-world files. Drawing merely 10 milliwatts of dynamic power and requiring zero DSP blocks, this system provides a highly viable, deployable solution for continuous edge-monitoring in critical defense and aerospace infrastructure.</w:t>
+      </w:r>
+    </w:p>
     <w:p>
       <w:pPr>
         <w:rPr>
@@ -2040,6 +2563,7 @@
           <w:b/>
           <w:bCs/>
         </w:rPr>
+        <w:lastRenderedPageBreak/>
         <w:t>Smith, W. A., &amp; Randall, R. B. (2015).</w:t>
       </w:r>
       <w:r>

</xml_diff>